<commit_message>
Fix OSM Overpass timeout — add mirror fallback servers
</commit_message>
<xml_diff>
--- a/docs/PRAANA_Detailed_Solution_Document.docx
+++ b/docs/PRAANA_Detailed_Solution_Document.docx
@@ -2,32 +2,6 @@
 <file path=word/document.xml><?xml version="1.0" encoding="utf-8"?>
 <w:document xmlns:wpc="http://schemas.microsoft.com/office/word/2010/wordprocessingCanvas" xmlns:cx="http://schemas.microsoft.com/office/drawing/2014/chartex" xmlns:mc="http://schemas.openxmlformats.org/markup-compatibility/2006" xmlns:o="urn:schemas-microsoft-com:office:office" xmlns:r="http://schemas.openxmlformats.org/officeDocument/2006/relationships" xmlns:m="http://schemas.openxmlformats.org/officeDocument/2006/math" xmlns:v="urn:schemas-microsoft-com:vml" xmlns:wp14="http://schemas.microsoft.com/office/word/2010/wordprocessingDrawing" xmlns:wp="http://schemas.openxmlformats.org/drawingml/2006/wordprocessingDrawing" xmlns:w10="urn:schemas-microsoft-com:office:word" xmlns:w="http://schemas.openxmlformats.org/wordprocessingml/2006/main" xmlns:w14="http://schemas.microsoft.com/office/word/2010/wordml" xmlns:w15="http://schemas.microsoft.com/office/word/2012/wordml" xmlns:w16se="http://schemas.microsoft.com/office/word/2015/wordml/symex" xmlns:wpg="http://schemas.microsoft.com/office/word/2010/wordprocessingGroup" xmlns:wpi="http://schemas.microsoft.com/office/word/2010/wordprocessingInk" xmlns:wne="http://schemas.microsoft.com/office/word/2006/wordml" xmlns:wps="http://schemas.microsoft.com/office/word/2010/wordprocessingShape" mc:Ignorable="w14 w15 w16se wp14">
   <w:body>
-    <w:p>
-      <w:pPr>
-        <w:spacing w:after="200"/>
-        <w:jc w:val="center"/>
-        <w:rPr>
-          <w:b/>
-          <w:bCs/>
-          <w:color w:val="595959"/>
-          <w:sz w:val="22"/>
-          <w:szCs w:val="22"/>
-        </w:rPr>
-      </w:pPr>
-    </w:p>
-    <w:p>
-      <w:pPr>
-        <w:spacing w:after="200"/>
-        <w:jc w:val="center"/>
-        <w:rPr>
-          <w:b/>
-          <w:bCs/>
-          <w:color w:val="595959"/>
-          <w:sz w:val="22"/>
-          <w:szCs w:val="22"/>
-        </w:rPr>
-      </w:pPr>
-    </w:p>
     <w:p>
       <w:pPr>
         <w:spacing w:after="200"/>
@@ -40,7 +14,11 @@
           <w:szCs w:val="22"/>
         </w:rPr>
       </w:pPr>
-      <w:r>
+    </w:p>
+    <w:p>
+      <w:pPr>
+        <w:spacing w:after="200"/>
+        <w:jc w:val="center"/>
         <w:rPr>
           <w:b/>
           <w:bCs/>
@@ -48,6 +26,28 @@
           <w:sz w:val="24"/>
           <w:szCs w:val="22"/>
         </w:rPr>
+      </w:pPr>
+    </w:p>
+    <w:p>
+      <w:pPr>
+        <w:spacing w:after="200"/>
+        <w:jc w:val="center"/>
+        <w:rPr>
+          <w:b/>
+          <w:bCs/>
+          <w:color w:val="595959"/>
+          <w:sz w:val="24"/>
+          <w:szCs w:val="22"/>
+        </w:rPr>
+      </w:pPr>
+      <w:r>
+        <w:rPr>
+          <w:b/>
+          <w:bCs/>
+          <w:color w:val="595959"/>
+          <w:sz w:val="24"/>
+          <w:szCs w:val="22"/>
+        </w:rPr>
         <w:t>ET AI HACKATHON 2026</w:t>
       </w:r>
     </w:p>
@@ -91,8 +91,6 @@
           <w:szCs w:val="24"/>
         </w:rPr>
       </w:pPr>
-      <w:bookmarkStart w:id="0" w:name="_GoBack"/>
-      <w:bookmarkEnd w:id="0"/>
       <w:r>
         <w:rPr>
           <w:i/>
@@ -106,6 +104,15 @@
     </w:p>
     <w:p>
       <w:pPr>
+        <w:spacing w:after="260"/>
+        <w:jc w:val="center"/>
+        <w:rPr>
+          <w:sz w:val="22"/>
+        </w:rPr>
+      </w:pPr>
+    </w:p>
+    <w:p>
+      <w:pPr>
         <w:spacing w:after="100"/>
         <w:jc w:val="center"/>
         <w:rPr>
@@ -127,26 +134,16 @@
         <w:spacing w:after="260"/>
         <w:jc w:val="center"/>
         <w:rPr>
+          <w:sz w:val="22"/>
+        </w:rPr>
+      </w:pPr>
+      <w:r>
+        <w:rPr>
           <w:color w:val="595959"/>
           <w:sz w:val="22"/>
         </w:rPr>
-      </w:pPr>
-      <w:r>
-        <w:rPr>
-          <w:color w:val="595959"/>
-          <w:sz w:val="22"/>
-        </w:rPr>
         <w:t>Theme: Smart Cities / Environmental Intelligence / Geospatial Analytics / Public Health</w:t>
       </w:r>
-    </w:p>
-    <w:p>
-      <w:pPr>
-        <w:spacing w:after="260"/>
-        <w:jc w:val="center"/>
-        <w:rPr>
-          <w:sz w:val="22"/>
-        </w:rPr>
-      </w:pPr>
     </w:p>
     <w:p>
       <w:pPr>
@@ -232,6 +229,8 @@
         </w:rPr>
         <w:br w:type="page"/>
       </w:r>
+      <w:bookmarkStart w:id="0" w:name="_GoBack"/>
+      <w:bookmarkEnd w:id="0"/>
     </w:p>
     <w:p>
       <w:pPr>
@@ -1359,7 +1358,7 @@
                 <w:color w:val="000000"/>
                 <w:szCs w:val="19"/>
               </w:rPr>
-              <w:t xml:space="preserve"> trained separately for the 24h, 48h, and 72h horizons on lag, rolling-window, and meteorological features, each evaluated against its own persistence baseline (</w:t>
+              <w:t xml:space="preserve"> trained separately for the 24h, 48h, and 72h horizons on lag, rolling-window, and meteorological features, each evaluated against its own persistence baseline, and now called live from the </w:t>
             </w:r>
             <w:proofErr w:type="spellStart"/>
             <w:r>
@@ -1367,6 +1366,29 @@
                 <w:color w:val="000000"/>
                 <w:szCs w:val="19"/>
               </w:rPr>
+              <w:t>Streamlit</w:t>
+            </w:r>
+            <w:proofErr w:type="spellEnd"/>
+            <w:r>
+              <w:rPr>
+                <w:color w:val="000000"/>
+                <w:szCs w:val="19"/>
+              </w:rPr>
+              <w:t xml:space="preserve"> app for the dashb</w:t>
+            </w:r>
+            <w:r>
+              <w:rPr>
+                <w:color w:val="000000"/>
+                <w:szCs w:val="19"/>
+              </w:rPr>
+              <w:t>oard's forecast checkpoints (</w:t>
+            </w:r>
+            <w:proofErr w:type="spellStart"/>
+            <w:r>
+              <w:rPr>
+                <w:color w:val="000000"/>
+                <w:szCs w:val="19"/>
+              </w:rPr>
               <w:t>src</w:t>
             </w:r>
             <w:proofErr w:type="spellEnd"/>
@@ -1375,7 +1397,39 @@
                 <w:color w:val="000000"/>
                 <w:szCs w:val="19"/>
               </w:rPr>
-              <w:t>/forecast_model.py).</w:t>
+              <w:t xml:space="preserve">/forecast_model.py: </w:t>
+            </w:r>
+            <w:proofErr w:type="spellStart"/>
+            <w:r>
+              <w:rPr>
+                <w:color w:val="000000"/>
+                <w:szCs w:val="19"/>
+              </w:rPr>
+              <w:t>train_all_horizon_models</w:t>
+            </w:r>
+            <w:proofErr w:type="spellEnd"/>
+            <w:r>
+              <w:rPr>
+                <w:color w:val="000000"/>
+                <w:szCs w:val="19"/>
+              </w:rPr>
+              <w:t xml:space="preserve">(), </w:t>
+            </w:r>
+            <w:proofErr w:type="spellStart"/>
+            <w:r>
+              <w:rPr>
+                <w:color w:val="000000"/>
+                <w:szCs w:val="19"/>
+              </w:rPr>
+              <w:t>predict_live</w:t>
+            </w:r>
+            <w:proofErr w:type="spellEnd"/>
+            <w:r>
+              <w:rPr>
+                <w:color w:val="000000"/>
+                <w:szCs w:val="19"/>
+              </w:rPr>
+              <w:t>()).</w:t>
             </w:r>
           </w:p>
         </w:tc>
@@ -1408,14 +1462,7 @@
                 <w:color w:val="000000"/>
                 <w:szCs w:val="19"/>
               </w:rPr>
-              <w:t>Graph Neural Network + Gaussian-</w:t>
-            </w:r>
-            <w:r>
-              <w:rPr>
-                <w:color w:val="000000"/>
-                <w:szCs w:val="19"/>
-              </w:rPr>
-              <w:t>plume dispersion blend layered on top of the per-horizon GBR models (see Section 7.2 note).</w:t>
+              <w:t>Graph Neural Network + Gaussian-plume dispersion blend layered on top of the per-horizon GBR models (see Section 7.2 note).</w:t>
             </w:r>
           </w:p>
         </w:tc>
@@ -2042,7 +2089,7 @@
         </w:rPr>
         <w:lastRenderedPageBreak/>
         <w:drawing>
-          <wp:inline distT="0" distB="0" distL="0" distR="0" wp14:anchorId="74D00439" wp14:editId="6B3EE91A">
+          <wp:inline distT="0" distB="0" distL="0" distR="0" wp14:anchorId="5EC0EAE5" wp14:editId="2A004203">
             <wp:extent cx="5715000" cy="3810000"/>
             <wp:effectExtent l="0" t="0" r="0" b="0"/>
             <wp:docPr id="1" name="Picture 1"/>
@@ -2142,7 +2189,7 @@
           <w:sz w:val="22"/>
           <w:szCs w:val="21"/>
         </w:rPr>
-        <w:t>Data Acquisition Layer: hourly pulls from CPCB CAAQMS, Open-</w:t>
+        <w:t xml:space="preserve">Data Acquisition Layer: hourly pulls from </w:t>
       </w:r>
       <w:proofErr w:type="spellStart"/>
       <w:r>
@@ -2150,6 +2197,22 @@
           <w:sz w:val="22"/>
           <w:szCs w:val="21"/>
         </w:rPr>
+        <w:t>OpenAQ</w:t>
+      </w:r>
+      <w:proofErr w:type="spellEnd"/>
+      <w:r>
+        <w:rPr>
+          <w:sz w:val="22"/>
+          <w:szCs w:val="21"/>
+        </w:rPr>
+        <w:t xml:space="preserve"> v3 (which aggregates CPCB CAAQMS and other public monitors) and Open-</w:t>
+      </w:r>
+      <w:proofErr w:type="spellStart"/>
+      <w:r>
+        <w:rPr>
+          <w:sz w:val="22"/>
+          <w:szCs w:val="21"/>
+        </w:rPr>
         <w:t>Meteo</w:t>
       </w:r>
       <w:proofErr w:type="spellEnd"/>
@@ -2158,7 +2221,14 @@
           <w:sz w:val="22"/>
           <w:szCs w:val="21"/>
         </w:rPr>
-        <w:t xml:space="preserve">, Sentinel-5P, and MODIS, plus one-time static loads from </w:t>
+        <w:t>, pl</w:t>
+      </w:r>
+      <w:r>
+        <w:rPr>
+          <w:sz w:val="22"/>
+          <w:szCs w:val="21"/>
+        </w:rPr>
+        <w:t xml:space="preserve">us a live </w:t>
       </w:r>
       <w:proofErr w:type="spellStart"/>
       <w:r>
@@ -2166,14 +2236,7 @@
           <w:sz w:val="22"/>
           <w:szCs w:val="21"/>
         </w:rPr>
-        <w:t>Open</w:t>
-      </w:r>
-      <w:r>
-        <w:rPr>
-          <w:sz w:val="22"/>
-          <w:szCs w:val="21"/>
-        </w:rPr>
-        <w:t>StreetMap</w:t>
+        <w:t>OpenStreetMap</w:t>
       </w:r>
       <w:proofErr w:type="spellEnd"/>
       <w:r>
@@ -2181,7 +2244,7 @@
           <w:sz w:val="22"/>
           <w:szCs w:val="21"/>
         </w:rPr>
-        <w:t xml:space="preserve"> and Census/</w:t>
+        <w:t xml:space="preserve"> Overpass query per request and a one-time static load of Census/</w:t>
       </w:r>
       <w:proofErr w:type="spellStart"/>
       <w:r>
@@ -2197,7 +2260,14 @@
           <w:sz w:val="22"/>
           <w:szCs w:val="21"/>
         </w:rPr>
-        <w:t xml:space="preserve"> ward boundaries.</w:t>
+        <w:t xml:space="preserve"> ward boundaries. Sentinel-5P and MODIS are documented data sources for the production design but are not yet integrated into the running prototype (see Section</w:t>
+      </w:r>
+      <w:r>
+        <w:rPr>
+          <w:sz w:val="22"/>
+          <w:szCs w:val="21"/>
+        </w:rPr>
+        <w:t xml:space="preserve"> 5).</w:t>
       </w:r>
     </w:p>
     <w:p>
@@ -2217,14 +2287,14 @@
           <w:sz w:val="22"/>
           <w:szCs w:val="21"/>
         </w:rPr>
-        <w:t>Unified Data Layer: aligns every source to a common hourly timestamp and ward/1km-grid cell, fills sensor gaps using nearby-station interpolation and satellite cross-validation, and maintains both the 2019–202</w:t>
-      </w:r>
-      <w:r>
-        <w:rPr>
-          <w:sz w:val="22"/>
-          <w:szCs w:val="21"/>
-        </w:rPr>
-        <w:t>4 historical archive and the live stream in one feature table.</w:t>
+        <w:t>Unified Data Layer: aligns every source to a common hourly timestamp and ward/1km-grid cell, fills sensor gaps using nearby-station interpolation and satellite cross-validation, and maintains both the 2019–2024 historical archive and the live stream i</w:t>
+      </w:r>
+      <w:r>
+        <w:rPr>
+          <w:sz w:val="22"/>
+          <w:szCs w:val="21"/>
+        </w:rPr>
+        <w:t>n one feature table.</w:t>
       </w:r>
     </w:p>
     <w:p>
@@ -2244,14 +2314,14 @@
           <w:sz w:val="22"/>
           <w:szCs w:val="21"/>
         </w:rPr>
-        <w:t>Emission Fingerprint Library: a reference table of chemical signatures per source category (vehicular, construction, crop-burning, industrial), built from IIT Kanpur's Delhi source-apportionmen</w:t>
-      </w:r>
-      <w:r>
-        <w:rPr>
-          <w:sz w:val="22"/>
-          <w:szCs w:val="21"/>
-        </w:rPr>
-        <w:t>t study, CPCB's emission inventory, and EPA emission factor databases — this is what Agent 1 matches live readings against.</w:t>
+        <w:t>Emission Fingerprint Library: a reference table of chemical signatures per source category (vehicular, construction, crop-burning, industrial), built from IIT Kanpur's Delhi source-apportionment study, CPCB's emission inventory, and EP</w:t>
+      </w:r>
+      <w:r>
+        <w:rPr>
+          <w:sz w:val="22"/>
+          <w:szCs w:val="21"/>
+        </w:rPr>
+        <w:t>A emission factor databases — this is what Agent 1 matches live readings against.</w:t>
       </w:r>
     </w:p>
     <w:p>
@@ -2421,6 +2491,7 @@
                 <w:color w:val="FFFFFF"/>
                 <w:szCs w:val="19"/>
               </w:rPr>
+              <w:lastRenderedPageBreak/>
               <w:t>Source</w:t>
             </w:r>
           </w:p>
@@ -2570,12 +2641,21 @@
                 <w:sz w:val="22"/>
               </w:rPr>
             </w:pPr>
-            <w:r>
-              <w:rPr>
-                <w:color w:val="000000"/>
-                <w:szCs w:val="19"/>
-              </w:rPr>
-              <w:t>CPCB CAAQMS</w:t>
+            <w:proofErr w:type="spellStart"/>
+            <w:r>
+              <w:rPr>
+                <w:color w:val="000000"/>
+                <w:szCs w:val="19"/>
+              </w:rPr>
+              <w:t>OpenAQ</w:t>
+            </w:r>
+            <w:proofErr w:type="spellEnd"/>
+            <w:r>
+              <w:rPr>
+                <w:color w:val="000000"/>
+                <w:szCs w:val="19"/>
+              </w:rPr>
+              <w:t xml:space="preserve"> v3 (CPCB-sourced)</w:t>
             </w:r>
           </w:p>
         </w:tc>
@@ -2671,7 +2751,23 @@
                 <w:color w:val="000000"/>
                 <w:szCs w:val="19"/>
               </w:rPr>
-              <w:t>40+ stations, Delhi NCR + Mumbai</w:t>
+              <w:t xml:space="preserve">Live via </w:t>
+            </w:r>
+            <w:proofErr w:type="spellStart"/>
+            <w:r>
+              <w:rPr>
+                <w:color w:val="000000"/>
+                <w:szCs w:val="19"/>
+              </w:rPr>
+              <w:t>OpenAQ</w:t>
+            </w:r>
+            <w:proofErr w:type="spellEnd"/>
+            <w:r>
+              <w:rPr>
+                <w:color w:val="000000"/>
+                <w:szCs w:val="19"/>
+              </w:rPr>
+              <w:t xml:space="preserve"> v3 across all 5 target cities; a direct CPCB CAAQMS MOU feed is roadmap</w:t>
             </w:r>
           </w:p>
         </w:tc>
@@ -2712,7 +2808,6 @@
                 <w:color w:val="000000"/>
                 <w:szCs w:val="19"/>
               </w:rPr>
-              <w:lastRenderedPageBreak/>
               <w:t>Open-</w:t>
             </w:r>
             <w:proofErr w:type="spellStart"/>
@@ -2925,7 +3020,7 @@
                 <w:color w:val="000000"/>
                 <w:szCs w:val="19"/>
               </w:rPr>
-              <w:t>Daily</w:t>
+              <w:t>Roadmap</w:t>
             </w:r>
           </w:p>
         </w:tc>
@@ -2957,7 +3052,7 @@
                 <w:color w:val="000000"/>
                 <w:szCs w:val="19"/>
               </w:rPr>
-              <w:t>City-wide coverage beyond sensor points</w:t>
+              <w:t>Not yet integrated — would add city-wide coverage beyond sensor points</w:t>
             </w:r>
           </w:p>
         </w:tc>
@@ -3064,7 +3159,7 @@
                 <w:color w:val="000000"/>
                 <w:szCs w:val="19"/>
               </w:rPr>
-              <w:t>Daily (Oct–Dec focus)</w:t>
+              <w:t>Roadmap (Oct–Dec focus)</w:t>
             </w:r>
           </w:p>
         </w:tc>
@@ -3097,7 +3192,7 @@
                 <w:color w:val="000000"/>
                 <w:szCs w:val="19"/>
               </w:rPr>
-              <w:t>Punjab &amp; Haryana stubble-burning season</w:t>
+              <w:t>Not yet integrated — would cover Punjab &amp; Haryana stubble-burning season</w:t>
             </w:r>
           </w:p>
         </w:tc>
@@ -3203,7 +3298,7 @@
                 <w:color w:val="000000"/>
                 <w:szCs w:val="19"/>
               </w:rPr>
-              <w:t>Static, one-time</w:t>
+              <w:t>Live (queried per request)</w:t>
             </w:r>
           </w:p>
         </w:tc>
@@ -3999,21 +4094,21 @@
                 <w:color w:val="7F6000"/>
                 <w:sz w:val="22"/>
               </w:rPr>
-              <w:t>This five-year archive is a synthetic dataset, statistically calibr</w:t>
+              <w:t>This five-year archive is</w:t>
             </w:r>
             <w:r>
               <w:rPr>
                 <w:color w:val="7F6000"/>
                 <w:sz w:val="22"/>
               </w:rPr>
-              <w:t>ated to published CPCB/IITM-SAFAR seasonal reports — seasonal means and variance, diurnal rush-hour patterns, the Diwali spike, and the documented ~50% AQI drop during the 2020 lockdown — not raw archived CAAQMS records. We built it this way so the full pi</w:t>
+              <w:t xml:space="preserve"> a synthetic dataset, statistically calibrated to published CPCB/IITM-SAFAR seasonal reports — seasonal means and variance, diurnal rush-hour patterns, the Diwali spike, and the documented ~50% AQI drop during the 2020 lockdown — not raw archived CAAQMS re</w:t>
             </w:r>
             <w:r>
               <w:rPr>
                 <w:color w:val="7F6000"/>
                 <w:sz w:val="22"/>
               </w:rPr>
-              <w:t>peline (feature engineering, model training, evaluation) could be built and stress-tested end-to-end before raw historical CAAQMS access is secured through the NCAP data-sharing MOU referenced in Section 12.</w:t>
+              <w:t>cords. We built it this way so the full pipeline (feature engineering, model training, evaluation) could be built and stress-tested end-to-end before raw historical CAAQMS access is secured through the NCAP data-sharing MOU referenced in Section 12.</w:t>
             </w:r>
           </w:p>
           <w:p>
@@ -4028,14 +4123,15 @@
                 <w:color w:val="7F6000"/>
                 <w:sz w:val="22"/>
               </w:rPr>
-              <w:t>What is NOT synthetic: the running prototype's c</w:t>
+              <w:lastRenderedPageBreak/>
+              <w:t>What i</w:t>
             </w:r>
             <w:r>
               <w:rPr>
                 <w:color w:val="7F6000"/>
                 <w:sz w:val="22"/>
               </w:rPr>
-              <w:t xml:space="preserve">urrent-conditions data. src/data_sources.py makes live calls to the </w:t>
+              <w:t xml:space="preserve">s NOT synthetic: the running prototype's current-conditions data. src/data_sources.py makes live calls to the </w:t>
             </w:r>
             <w:proofErr w:type="spellStart"/>
             <w:r>
@@ -4083,14 +4179,14 @@
                 <w:color w:val="7F6000"/>
                 <w:sz w:val="22"/>
               </w:rPr>
-              <w:t xml:space="preserve"> and clear error messages if a station or key is unavailable — this part of the demo is real, live data, n</w:t>
+              <w:t xml:space="preserve"> and clear error messages if a station or key is unavailable — t</w:t>
             </w:r>
             <w:r>
               <w:rPr>
                 <w:color w:val="7F6000"/>
                 <w:sz w:val="22"/>
               </w:rPr>
-              <w:t>ot a canned dataset.</w:t>
+              <w:t>his part of the demo is real, live data, not a canned dataset.</w:t>
             </w:r>
           </w:p>
           <w:p>
@@ -4105,7 +4201,14 @@
                 <w:color w:val="7F6000"/>
                 <w:sz w:val="22"/>
               </w:rPr>
-              <w:t>The immediate next validation step, ahead of any production pilot, is re-running Section 13's forecasting benchmark against real archived CAAQMS history rather than the synthetic calibration set.</w:t>
+              <w:t>The immediate next validation step, ahead of any production pilot, is re-running Section 13's forecasting benchmark against real archived CAAQMS history rather than the synthetic calibration se</w:t>
+            </w:r>
+            <w:r>
+              <w:rPr>
+                <w:color w:val="7F6000"/>
+                <w:sz w:val="22"/>
+              </w:rPr>
+              <w:t>t.</w:t>
             </w:r>
           </w:p>
         </w:tc>
@@ -4528,6 +4631,7 @@
           <w:color w:val="1F3864"/>
           <w:szCs w:val="30"/>
         </w:rPr>
+        <w:lastRenderedPageBreak/>
         <w:t>7. Agent 2 — Hy</w:t>
       </w:r>
       <w:r>
@@ -4642,7 +4746,6 @@
           <w:sz w:val="22"/>
           <w:szCs w:val="21"/>
         </w:rPr>
-        <w:lastRenderedPageBreak/>
         <w:t>Diwali night produces a sharp PM2.5 spike that takes several days to clear.</w:t>
       </w:r>
     </w:p>
@@ -4769,14 +4872,69 @@
           <w:sz w:val="22"/>
           <w:szCs w:val="21"/>
         </w:rPr>
-        <w:t>own model predicting its own real future target, forecast error genuinely increases with horizon (see Section 13) rather than being identical across all three windows, which is the behaviour a legitimate multi-horizon forecaster should show. The GNN and di</w:t>
-      </w:r>
-      <w:r>
-        <w:rPr>
-          <w:sz w:val="22"/>
-          <w:szCs w:val="21"/>
-        </w:rPr>
-        <w:t>spersion-model components described above remain the production target and are called out explicitly as roadmap in Section 12's technology-stack table.</w:t>
+        <w:t>own model predicting its own real future target, forecast error genuinely increases with horizon (see Section 13) rather than being identical across all three windows, which is the behaviour a legitimate multi-horizon forecaster should show. These three tr</w:t>
+      </w:r>
+      <w:r>
+        <w:rPr>
+          <w:sz w:val="22"/>
+          <w:szCs w:val="21"/>
+        </w:rPr>
+        <w:t>ained models are also wired directly into the live app (</w:t>
+      </w:r>
+      <w:proofErr w:type="spellStart"/>
+      <w:r>
+        <w:rPr>
+          <w:sz w:val="22"/>
+          <w:szCs w:val="21"/>
+        </w:rPr>
+        <w:t>forecast_</w:t>
+      </w:r>
+      <w:proofErr w:type="gramStart"/>
+      <w:r>
+        <w:rPr>
+          <w:sz w:val="22"/>
+          <w:szCs w:val="21"/>
+        </w:rPr>
+        <w:t>model.train</w:t>
+      </w:r>
+      <w:proofErr w:type="gramEnd"/>
+      <w:r>
+        <w:rPr>
+          <w:sz w:val="22"/>
+          <w:szCs w:val="21"/>
+        </w:rPr>
+        <w:t>_all_horizon_models</w:t>
+      </w:r>
+      <w:proofErr w:type="spellEnd"/>
+      <w:r>
+        <w:rPr>
+          <w:sz w:val="22"/>
+          <w:szCs w:val="21"/>
+        </w:rPr>
+        <w:t xml:space="preserve">() / </w:t>
+      </w:r>
+      <w:proofErr w:type="spellStart"/>
+      <w:r>
+        <w:rPr>
+          <w:sz w:val="22"/>
+          <w:szCs w:val="21"/>
+        </w:rPr>
+        <w:t>predict_live</w:t>
+      </w:r>
+      <w:proofErr w:type="spellEnd"/>
+      <w:r>
+        <w:rPr>
+          <w:sz w:val="22"/>
+          <w:szCs w:val="21"/>
+        </w:rPr>
+        <w:t>(), called from app/streamlit_app.py): the 24h/48h/72h points on the dashboard's forecast chart are genuine model output, not the standalone eva</w:t>
+      </w:r>
+      <w:r>
+        <w:rPr>
+          <w:sz w:val="22"/>
+          <w:szCs w:val="21"/>
+        </w:rPr>
+        <w:t>luation script alone. The GNN and dispersion-model components described above remain the production target and are called out explicitly as roadmap in Section 12's technology-stack table.</w:t>
       </w:r>
     </w:p>
     <w:p>
@@ -4809,14 +4967,44 @@
           <w:sz w:val="22"/>
           <w:szCs w:val="21"/>
         </w:rPr>
-        <w:t>Input: current AQI readings across all stations plus the 72-hour met</w:t>
-      </w:r>
-      <w:r>
-        <w:rPr>
-          <w:sz w:val="22"/>
-          <w:szCs w:val="21"/>
-        </w:rPr>
-        <w:t>eorological forecast. Output: predicted AQI for every ward at roughly 1km grid resolution for each of the next 72 hours, with a confidence range — directly matching the challenge brief's call for 24–72 hour forecasts at 1km resolution.</w:t>
+        <w:t>Input: current AQI readings acro</w:t>
+      </w:r>
+      <w:r>
+        <w:rPr>
+          <w:sz w:val="22"/>
+          <w:szCs w:val="21"/>
+        </w:rPr>
+        <w:t xml:space="preserve">ss all stations plus the 72-hour meteorological forecast. Output: predicted AQI for every ward at roughly 1km grid resolution for each of the next 72 hours, with a confidence range — directly matching the challenge brief's call for 24–72 hour forecasts at </w:t>
+      </w:r>
+      <w:r>
+        <w:rPr>
+          <w:sz w:val="22"/>
+          <w:szCs w:val="21"/>
+        </w:rPr>
+        <w:t>1km resolution. The 24h, 48h, and 72h points are genuine output from the trained per-horizon models described in 7.2; the hourly curve connecting those three points uses a lighter wind/rain/diurnal heuristic (</w:t>
+      </w:r>
+      <w:proofErr w:type="spellStart"/>
+      <w:r>
+        <w:rPr>
+          <w:sz w:val="22"/>
+          <w:szCs w:val="21"/>
+        </w:rPr>
+        <w:t>src</w:t>
+      </w:r>
+      <w:proofErr w:type="spellEnd"/>
+      <w:r>
+        <w:rPr>
+          <w:sz w:val="22"/>
+          <w:szCs w:val="21"/>
+        </w:rPr>
+        <w:t xml:space="preserve">/forecast.py) for smooth display, since the </w:t>
+      </w:r>
+      <w:r>
+        <w:rPr>
+          <w:sz w:val="22"/>
+          <w:szCs w:val="21"/>
+        </w:rPr>
+        <w:t>trained models only predict at those three discrete horizons.</w:t>
       </w:r>
     </w:p>
     <w:p>
@@ -4834,8 +5022,66 @@
           <w:sz w:val="28"/>
           <w:szCs w:val="24"/>
         </w:rPr>
-        <w:t>7.4 Validation Appro</w:t>
-      </w:r>
+        <w:t>7.4 Validation Approach</w:t>
+      </w:r>
+    </w:p>
+    <w:p>
+      <w:pPr>
+        <w:spacing w:after="160"/>
+        <w:rPr>
+          <w:sz w:val="22"/>
+        </w:rPr>
+      </w:pPr>
+      <w:r>
+        <w:rPr>
+          <w:sz w:val="22"/>
+          <w:szCs w:val="21"/>
+        </w:rPr>
+        <w:t>Forecast quality is benchmarked using RMSE against a persistence baseline on held-out 2024 data (Section 13). The production validation plan adds separate RMSE tracking f</w:t>
+      </w:r>
+      <w:r>
+        <w:rPr>
+          <w:sz w:val="22"/>
+          <w:szCs w:val="21"/>
+        </w:rPr>
+        <w:t>or the pre-monsoon, monsoon, post-monsoon stubble-burning, and winter inversion seasons, and — critically — a re-run of the same benchmark against real archived CAAQMS history rather than the synthetic calibration set described in Section 5.1.</w:t>
+      </w:r>
+    </w:p>
+    <w:p>
+      <w:pPr>
+        <w:pStyle w:val="Heading1"/>
+        <w:spacing w:before="360" w:after="160"/>
+        <w:rPr>
+          <w:sz w:val="36"/>
+        </w:rPr>
+      </w:pPr>
+      <w:r>
+        <w:rPr>
+          <w:b/>
+          <w:bCs/>
+          <w:color w:val="1F3864"/>
+          <w:szCs w:val="30"/>
+        </w:rPr>
+        <w:t>8. Agent 3 —</w:t>
+      </w:r>
+      <w:r>
+        <w:rPr>
+          <w:b/>
+          <w:bCs/>
+          <w:color w:val="1F3864"/>
+          <w:szCs w:val="30"/>
+        </w:rPr>
+        <w:t xml:space="preserve"> Enforcement Intelligence &amp; Prioritisation Agent</w:t>
+      </w:r>
+    </w:p>
+    <w:p>
+      <w:pPr>
+        <w:pStyle w:val="Heading2"/>
+        <w:spacing w:before="240" w:after="120"/>
+        <w:rPr>
+          <w:sz w:val="28"/>
+        </w:rPr>
+      </w:pPr>
       <w:r>
         <w:rPr>
           <w:b/>
@@ -4843,7 +5089,7 @@
           <w:sz w:val="28"/>
           <w:szCs w:val="24"/>
         </w:rPr>
-        <w:t>ach</w:t>
+        <w:t>8.1 From Insight to Action</w:t>
       </w:r>
     </w:p>
     <w:p>
@@ -4858,32 +5104,30 @@
           <w:sz w:val="22"/>
           <w:szCs w:val="21"/>
         </w:rPr>
-        <w:t>Forecast quality is benchmarked using RMSE against a persistence baseline on held-out 2024 data (Section 13). The production validation plan adds separate RMSE tracking for the pre-monsoon, monsoon, post-monsoon stubble-burning, and winter inversion se</w:t>
-      </w:r>
-      <w:r>
-        <w:rPr>
-          <w:sz w:val="22"/>
-          <w:szCs w:val="21"/>
-        </w:rPr>
-        <w:t>asons, and — critically — a re-run of the same benchmark against real archived CAAQMS history rather than the synthetic calibration set described in Section 5.1.</w:t>
-      </w:r>
-    </w:p>
-    <w:p>
-      <w:pPr>
-        <w:pStyle w:val="Heading1"/>
-        <w:spacing w:before="360" w:after="160"/>
-        <w:rPr>
-          <w:sz w:val="36"/>
-        </w:rPr>
-      </w:pPr>
-      <w:r>
-        <w:rPr>
-          <w:b/>
-          <w:bCs/>
-          <w:color w:val="1F3864"/>
-          <w:szCs w:val="30"/>
-        </w:rPr>
-        <w:t>8. Agent 3 — Enforcement Intelligence &amp; Prioritisation Agent</w:t>
+        <w:t>This agent converts Agent 1's attribution and Agent 2's forecast into a concrete to-do list. If Agent 1 shows that 70% of a ward's current pollution is construction-related, this a</w:t>
+      </w:r>
+      <w:r>
+        <w:rPr>
+          <w:sz w:val="22"/>
+          <w:szCs w:val="21"/>
+        </w:rPr>
+        <w:t xml:space="preserve">gent cross-references </w:t>
+      </w:r>
+      <w:proofErr w:type="spellStart"/>
+      <w:r>
+        <w:rPr>
+          <w:sz w:val="22"/>
+          <w:szCs w:val="21"/>
+        </w:rPr>
+        <w:t>OpenStreetMap</w:t>
+      </w:r>
+      <w:proofErr w:type="spellEnd"/>
+      <w:r>
+        <w:rPr>
+          <w:sz w:val="22"/>
+          <w:szCs w:val="21"/>
+        </w:rPr>
+        <w:t xml:space="preserve"> and municipal records to identify every registered construction site in that ward, then estimates the AQI reduction that would follow from inspecting and remediating violations at each site.</w:t>
       </w:r>
     </w:p>
     <w:p>
@@ -4901,7 +5145,8 @@
           <w:sz w:val="28"/>
           <w:szCs w:val="24"/>
         </w:rPr>
-        <w:t>8.1 From Insight to Action</w:t>
+        <w:lastRenderedPageBreak/>
+        <w:t>8.2 Ranking Logic</w:t>
       </w:r>
     </w:p>
     <w:p>
@@ -4916,77 +5161,14 @@
           <w:sz w:val="22"/>
           <w:szCs w:val="21"/>
         </w:rPr>
-        <w:t>This a</w:t>
-      </w:r>
-      <w:r>
-        <w:rPr>
-          <w:sz w:val="22"/>
-          <w:szCs w:val="21"/>
-        </w:rPr>
-        <w:t xml:space="preserve">gent converts Agent 1's attribution and Agent 2's forecast into a concrete to-do list. If Agent 1 shows that 70% of a ward's current pollution is construction-related, this agent cross-references </w:t>
-      </w:r>
-      <w:proofErr w:type="spellStart"/>
-      <w:r>
-        <w:rPr>
-          <w:sz w:val="22"/>
-          <w:szCs w:val="21"/>
-        </w:rPr>
-        <w:t>OpenStreetMap</w:t>
-      </w:r>
-      <w:proofErr w:type="spellEnd"/>
-      <w:r>
-        <w:rPr>
-          <w:sz w:val="22"/>
-          <w:szCs w:val="21"/>
-        </w:rPr>
-        <w:t xml:space="preserve"> and municipal records to identify every regist</w:t>
-      </w:r>
-      <w:r>
-        <w:rPr>
-          <w:sz w:val="22"/>
-          <w:szCs w:val="21"/>
-        </w:rPr>
-        <w:t>ered construction site in that ward, then estimates the AQI reduction that would follow from inspecting and remediating violations at each site.</w:t>
-      </w:r>
-    </w:p>
-    <w:p>
-      <w:pPr>
-        <w:pStyle w:val="Heading2"/>
-        <w:spacing w:before="240" w:after="120"/>
-        <w:rPr>
-          <w:sz w:val="28"/>
-        </w:rPr>
-      </w:pPr>
-      <w:r>
-        <w:rPr>
-          <w:b/>
-          <w:bCs/>
-          <w:sz w:val="28"/>
-          <w:szCs w:val="24"/>
-        </w:rPr>
-        <w:t>8.2 Ranking Logic</w:t>
-      </w:r>
-    </w:p>
-    <w:p>
-      <w:pPr>
-        <w:spacing w:after="160"/>
-        <w:rPr>
-          <w:sz w:val="22"/>
-        </w:rPr>
-      </w:pPr>
-      <w:r>
-        <w:rPr>
-          <w:sz w:val="22"/>
-          <w:szCs w:val="21"/>
-        </w:rPr>
-        <w:t>Every possible enforcement action across the city is scored by expected AQI impact and ranked</w:t>
-      </w:r>
-      <w:r>
-        <w:rPr>
-          <w:sz w:val="22"/>
-          <w:szCs w:val="21"/>
-        </w:rPr>
-        <w:t xml:space="preserve"> into a single prioritised list:</w:t>
+        <w:t>Every possi</w:t>
+      </w:r>
+      <w:r>
+        <w:rPr>
+          <w:sz w:val="22"/>
+          <w:szCs w:val="21"/>
+        </w:rPr>
+        <w:t>ble enforcement action across the city is scored by expected AQI impact and ranked into a single prioritised list:</w:t>
       </w:r>
     </w:p>
     <w:p>
@@ -5042,7 +5224,14 @@
           <w:sz w:val="22"/>
           <w:szCs w:val="21"/>
         </w:rPr>
-        <w:t xml:space="preserve">Deploy diesel-vehicle checks at the NH48 entry point — expected 12% NO2 reduction in </w:t>
+        <w:t>Deploy diesel-vehicle checks at the NH48 entry p</w:t>
+      </w:r>
+      <w:r>
+        <w:rPr>
+          <w:sz w:val="22"/>
+          <w:szCs w:val="21"/>
+        </w:rPr>
+        <w:t xml:space="preserve">oint — expected 12% NO2 reduction in </w:t>
       </w:r>
       <w:proofErr w:type="spellStart"/>
       <w:r>
@@ -5071,14 +5260,7 @@
           <w:sz w:val="22"/>
           <w:szCs w:val="21"/>
         </w:rPr>
-        <w:t>Issue notice to the industrial cluster</w:t>
-      </w:r>
-      <w:r>
-        <w:rPr>
-          <w:sz w:val="22"/>
-          <w:szCs w:val="21"/>
-        </w:rPr>
-        <w:t xml:space="preserve"> in </w:t>
+        <w:t xml:space="preserve">Issue notice to the industrial cluster in </w:t>
       </w:r>
       <w:proofErr w:type="spellStart"/>
       <w:r>
@@ -5127,14 +5309,14 @@
           <w:sz w:val="22"/>
           <w:szCs w:val="21"/>
         </w:rPr>
-        <w:t>Every recommendation ships with the supporting evidence — which sensor showed what, which satellite pass confirmed it, and what the wind pattern was at the time — so a muni</w:t>
-      </w:r>
-      <w:r>
-        <w:rPr>
-          <w:sz w:val="22"/>
-          <w:szCs w:val="21"/>
-        </w:rPr>
-        <w:t>cipal officer or pollution-control authority can defend the action and a domain expert can rate its quality.</w:t>
+        <w:t xml:space="preserve">Every recommendation ships with the supporting evidence — which sensor showed what, which </w:t>
+      </w:r>
+      <w:r>
+        <w:rPr>
+          <w:sz w:val="22"/>
+          <w:szCs w:val="21"/>
+        </w:rPr>
+        <w:t>satellite pass confirmed it, and what the wind pattern was at the time — so a municipal officer or pollution-control authority can defend the action and a domain expert can rate its quality.</w:t>
       </w:r>
     </w:p>
     <w:p>
@@ -5152,7 +5334,6 @@
           <w:color w:val="1F3864"/>
           <w:szCs w:val="30"/>
         </w:rPr>
-        <w:lastRenderedPageBreak/>
         <w:t>9. Agent 4 — Multi-City Comparative Intelligence Dashboard</w:t>
       </w:r>
     </w:p>
@@ -5168,14 +5349,14 @@
           <w:sz w:val="22"/>
           <w:szCs w:val="21"/>
         </w:rPr>
-        <w:t>Delhi and Mumbai are the primary build-and-validate cities. The architecture is city-agn</w:t>
-      </w:r>
-      <w:r>
-        <w:rPr>
-          <w:sz w:val="22"/>
-          <w:szCs w:val="21"/>
-        </w:rPr>
-        <w:t>ostic: every agent operates on the same unified ward-hour feature table regardless of which city's CAAQMS feed populates it.</w:t>
+        <w:t xml:space="preserve">Delhi </w:t>
+      </w:r>
+      <w:r>
+        <w:rPr>
+          <w:sz w:val="22"/>
+          <w:szCs w:val="21"/>
+        </w:rPr>
+        <w:t>and Mumbai are the primary build-and-validate cities. The architecture is city-agnostic: every agent operates on the same unified ward-hour feature table regardless of which city's CAAQMS feed populates it.</w:t>
       </w:r>
     </w:p>
     <w:p>
@@ -5213,7 +5394,14 @@
           <w:sz w:val="22"/>
           <w:szCs w:val="21"/>
         </w:rPr>
-        <w:t xml:space="preserve">Side-by-side AQI trend lines for every </w:t>
+        <w:t>Side-by-side AQI tre</w:t>
+      </w:r>
+      <w:r>
+        <w:rPr>
+          <w:sz w:val="22"/>
+          <w:szCs w:val="21"/>
+        </w:rPr>
+        <w:t xml:space="preserve">nd lines for every </w:t>
       </w:r>
       <w:proofErr w:type="spellStart"/>
       <w:r>
@@ -5229,14 +5417,7 @@
           <w:sz w:val="22"/>
           <w:szCs w:val="21"/>
         </w:rPr>
-        <w:t xml:space="preserve"> city, normalised by season so administrators compare </w:t>
-      </w:r>
-      <w:r>
-        <w:rPr>
-          <w:sz w:val="22"/>
-          <w:szCs w:val="21"/>
-        </w:rPr>
-        <w:t>like-for-like periods.</w:t>
+        <w:t xml:space="preserve"> city, normalised by season so administrators compare like-for-like periods.</w:t>
       </w:r>
     </w:p>
     <w:p>
@@ -5256,14 +5437,14 @@
           <w:sz w:val="22"/>
           <w:szCs w:val="21"/>
         </w:rPr>
-        <w:t>Intervention-effectiveness tracking: when a city deploys an enforcement action recommended by Agent 3, the dashboard measures the realised AQI change against the predicted change, building a growing evidence base of what actually wor</w:t>
-      </w:r>
-      <w:r>
-        <w:rPr>
-          <w:sz w:val="22"/>
-          <w:szCs w:val="21"/>
-        </w:rPr>
-        <w:t>ks. (Roadmap — requires logged real-world before/after outcomes; not yet populated with live data.)</w:t>
+        <w:t>Intervention-effectiveness tracking: when a city deploys an enforcement action recommended by Agent 3, the dashboard measures the realised AQI change a</w:t>
+      </w:r>
+      <w:r>
+        <w:rPr>
+          <w:sz w:val="22"/>
+          <w:szCs w:val="21"/>
+        </w:rPr>
+        <w:t>gainst the predicted change, building a growing evidence base of what actually works. (Roadmap — requires logged real-world before/after outcomes; not yet populated with live data.)</w:t>
       </w:r>
     </w:p>
     <w:p>
@@ -5283,14 +5464,14 @@
           <w:sz w:val="22"/>
           <w:szCs w:val="21"/>
         </w:rPr>
-        <w:t>Cross-city learning: if a construction-dust-control measure in Mumbai produced a larger-than-expected PM10 reduction, the dashboard surfaces that interventi</w:t>
-      </w:r>
-      <w:r>
-        <w:rPr>
-          <w:sz w:val="22"/>
-          <w:szCs w:val="21"/>
-        </w:rPr>
-        <w:t>on as a candidate recommendation for Delhi wards with a similar source-attribution profile.</w:t>
+        <w:t>Cross-city learning: if a construction-dust-control measure in Mumbai prod</w:t>
+      </w:r>
+      <w:r>
+        <w:rPr>
+          <w:sz w:val="22"/>
+          <w:szCs w:val="21"/>
+        </w:rPr>
+        <w:t>uced a larger-than-expected PM10 reduction, the dashboard surfaces that intervention as a candidate recommendation for Delhi wards with a similar source-attribution profile.</w:t>
       </w:r>
     </w:p>
     <w:p>
@@ -5310,7 +5491,7 @@
           <w:sz w:val="22"/>
           <w:szCs w:val="21"/>
         </w:rPr>
-        <w:t xml:space="preserve">A staged rollout path — Delhi NCR and Mumbai at launch, with Kolkata, Bengaluru, and Chennai </w:t>
+        <w:t>Agent 4's live AQI comparison already runs across all 5 target cities today (</w:t>
       </w:r>
       <w:proofErr w:type="spellStart"/>
       <w:r>
@@ -5318,7 +5499,7 @@
           <w:sz w:val="22"/>
           <w:szCs w:val="21"/>
         </w:rPr>
-        <w:t>onboarded</w:t>
+        <w:t>src</w:t>
       </w:r>
       <w:proofErr w:type="spellEnd"/>
       <w:r>
@@ -5326,7 +5507,30 @@
           <w:sz w:val="22"/>
           <w:szCs w:val="21"/>
         </w:rPr>
-        <w:t xml:space="preserve"> next using the same pipeline.</w:t>
+        <w:t xml:space="preserve">/multicity.py), not a staged 2-then-3 </w:t>
+      </w:r>
+      <w:proofErr w:type="gramStart"/>
+      <w:r>
+        <w:rPr>
+          <w:sz w:val="22"/>
+          <w:szCs w:val="21"/>
+        </w:rPr>
+        <w:t>rollout</w:t>
+      </w:r>
+      <w:proofErr w:type="gramEnd"/>
+      <w:r>
+        <w:rPr>
+          <w:sz w:val="22"/>
+          <w:szCs w:val="21"/>
+        </w:rPr>
+        <w:t>. Delhi NCR and Mumbai carry deeper per-agent validation — the trained forecast models and the wind-confounder self-test scenario a</w:t>
+      </w:r>
+      <w:r>
+        <w:rPr>
+          <w:sz w:val="22"/>
+          <w:szCs w:val="21"/>
+        </w:rPr>
+        <w:t>re both built against Delhi data — with the same validation depth extending to the other 3 cities as the near-term roadmap item, not basic live coverage itself.</w:t>
       </w:r>
     </w:p>
     <w:p>
@@ -5359,14 +5563,7 @@
           <w:sz w:val="22"/>
           <w:szCs w:val="21"/>
         </w:rPr>
-        <w:t>This is the public-facing layer of the same intelligence stack — no new modelling is required, only citizen-friendly presentation of Agent 1 and Agent 2's outputs, layered with population-vulnerability data</w:t>
-      </w:r>
-      <w:r>
-        <w:rPr>
-          <w:sz w:val="22"/>
-          <w:szCs w:val="21"/>
-        </w:rPr>
-        <w:t>.</w:t>
+        <w:t>This is the public-facing layer of the same intelligence stack — no new modelling is required, only citizen-friendly presentation of Agent 1 and Agent 2's outputs, layered with population-vulnerability data.</w:t>
       </w:r>
     </w:p>
     <w:p>
@@ -5404,7 +5601,14 @@
           <w:sz w:val="22"/>
           <w:szCs w:val="21"/>
         </w:rPr>
-        <w:t>Shows every resident their ward's current and next-72-hour AQI.</w:t>
+        <w:t>Shows every resident their war</w:t>
+      </w:r>
+      <w:r>
+        <w:rPr>
+          <w:sz w:val="22"/>
+          <w:szCs w:val="21"/>
+        </w:rPr>
+        <w:t>d's current and next-72-hour AQI.</w:t>
       </w:r>
     </w:p>
     <w:p>
@@ -5444,14 +5648,14 @@
           <w:sz w:val="22"/>
           <w:szCs w:val="21"/>
         </w:rPr>
-        <w:t>Pushes regional-lan</w:t>
-      </w:r>
-      <w:r>
-        <w:rPr>
-          <w:sz w:val="22"/>
-          <w:szCs w:val="21"/>
-        </w:rPr>
-        <w:t xml:space="preserve">guage advisories through mobile apps, public displays, and IVR — Hindi in Delhi, Marathi in Mumbai, Bengali in Kolkata, Kannada in Bengaluru, Tamil in Chennai. (English and Hindi are </w:t>
+        <w:t>Pushes regional-language advisories through mobile apps, public displ</w:t>
+      </w:r>
+      <w:r>
+        <w:rPr>
+          <w:sz w:val="22"/>
+          <w:szCs w:val="21"/>
+        </w:rPr>
+        <w:t xml:space="preserve">ays, and IVR — Hindi in Delhi, Marathi in Mumbai, Bengali in Kolkata, Kannada in Bengaluru, Tamil in Chennai. (English and Hindi are </w:t>
       </w:r>
       <w:proofErr w:type="spellStart"/>
       <w:r>
@@ -5467,14 +5671,14 @@
           <w:sz w:val="22"/>
           <w:szCs w:val="21"/>
         </w:rPr>
-        <w:t xml:space="preserve"> and running today; the remaining languages and natural, varied </w:t>
-      </w:r>
-      <w:r>
-        <w:rPr>
-          <w:sz w:val="22"/>
-          <w:szCs w:val="21"/>
-        </w:rPr>
-        <w:t>phrasing are the Claude-API roadmap item in Section 12.)</w:t>
+        <w:t xml:space="preserve"> and running today; the remaining languages and natural, varied phrasing are the Claude-API roadmap item in Sectio</w:t>
+      </w:r>
+      <w:r>
+        <w:rPr>
+          <w:sz w:val="22"/>
+          <w:szCs w:val="21"/>
+        </w:rPr>
+        <w:t>n 12.)</w:t>
       </w:r>
     </w:p>
     <w:p>
@@ -5528,6 +5732,7 @@
           <w:color w:val="1F3864"/>
           <w:szCs w:val="30"/>
         </w:rPr>
+        <w:lastRenderedPageBreak/>
         <w:t>11. Differentiation</w:t>
       </w:r>
     </w:p>
@@ -5543,21 +5748,14 @@
           <w:sz w:val="22"/>
           <w:szCs w:val="21"/>
         </w:rPr>
-        <w:t>PRA</w:t>
-      </w:r>
-      <w:r>
-        <w:rPr>
-          <w:sz w:val="22"/>
-          <w:szCs w:val="21"/>
-        </w:rPr>
-        <w:t>ANA acknowledges two existing solutions that operate in a related space — IITM-DSS and SAFAR — and is designed to complement, not duplicate, their work. The specific gaps PRAANA fills are ward-level granularity, enforcement action ranking, and cross-city l</w:t>
-      </w:r>
-      <w:r>
-        <w:rPr>
-          <w:sz w:val="22"/>
-          <w:szCs w:val="21"/>
-        </w:rPr>
-        <w:t>earning.</w:t>
+        <w:t>PRAANA acknowledges two existing solutions that opera</w:t>
+      </w:r>
+      <w:r>
+        <w:rPr>
+          <w:sz w:val="22"/>
+          <w:szCs w:val="21"/>
+        </w:rPr>
+        <w:t>te in a related space — IITM-DSS and SAFAR — and is designed to complement, not duplicate, their work. The specific gaps PRAANA fills are ward-level granularity, enforcement action ranking, and cross-city learning.</w:t>
       </w:r>
     </w:p>
     <w:tbl>
@@ -5693,7 +5891,16 @@
                 <w:color w:val="FFFFFF"/>
                 <w:szCs w:val="19"/>
               </w:rPr>
-              <w:t>What PRAANA Does Differently</w:t>
+              <w:t>What PRAANA Do</w:t>
+            </w:r>
+            <w:r>
+              <w:rPr>
+                <w:b/>
+                <w:bCs/>
+                <w:color w:val="FFFFFF"/>
+                <w:szCs w:val="19"/>
+              </w:rPr>
+              <w:t>es Differently</w:t>
             </w:r>
           </w:p>
         </w:tc>
@@ -5838,7 +6045,6 @@
                 <w:color w:val="000000"/>
                 <w:szCs w:val="19"/>
               </w:rPr>
-              <w:lastRenderedPageBreak/>
               <w:t>SAFAR (IITM)</w:t>
             </w:r>
           </w:p>
@@ -6607,13 +6813,6 @@
                 <w:sz w:val="22"/>
               </w:rPr>
             </w:pPr>
-            <w:r>
-              <w:rPr>
-                <w:color w:val="000000"/>
-                <w:szCs w:val="19"/>
-              </w:rPr>
-              <w:t xml:space="preserve">Sentinel-5P, MODIS, </w:t>
-            </w:r>
             <w:proofErr w:type="spellStart"/>
             <w:r>
               <w:rPr>
@@ -6628,7 +6827,7 @@
                 <w:color w:val="000000"/>
                 <w:szCs w:val="19"/>
               </w:rPr>
-              <w:t xml:space="preserve"> Overpass API (live), Census/</w:t>
+              <w:t xml:space="preserve"> Overpass API (live, with multi-mirror </w:t>
             </w:r>
             <w:proofErr w:type="spellStart"/>
             <w:r>
@@ -6636,6 +6835,22 @@
                 <w:color w:val="000000"/>
                 <w:szCs w:val="19"/>
               </w:rPr>
+              <w:t>fallback</w:t>
+            </w:r>
+            <w:proofErr w:type="spellEnd"/>
+            <w:r>
+              <w:rPr>
+                <w:color w:val="000000"/>
+                <w:szCs w:val="19"/>
+              </w:rPr>
+              <w:t>), Census/</w:t>
+            </w:r>
+            <w:proofErr w:type="spellStart"/>
+            <w:r>
+              <w:rPr>
+                <w:color w:val="000000"/>
+                <w:szCs w:val="19"/>
+              </w:rPr>
               <w:t>DataMeet</w:t>
             </w:r>
             <w:proofErr w:type="spellEnd"/>
@@ -6644,7 +6859,7 @@
                 <w:color w:val="000000"/>
                 <w:szCs w:val="19"/>
               </w:rPr>
-              <w:t xml:space="preserve"> ward boundaries</w:t>
+              <w:t xml:space="preserve"> ward boundaries (static)</w:t>
             </w:r>
           </w:p>
         </w:tc>
@@ -6676,7 +6891,7 @@
                 <w:color w:val="000000"/>
                 <w:szCs w:val="19"/>
               </w:rPr>
-              <w:t>Google Earth Engine for batch satellite processing</w:t>
+              <w:t>Sentinel-5P (TROPOMI) and MODIS Active Fire integration; Google Earth Engine for batch satellite processing</w:t>
             </w:r>
           </w:p>
         </w:tc>
@@ -6994,6 +7209,7 @@
                 <w:color w:val="000000"/>
                 <w:szCs w:val="19"/>
               </w:rPr>
+              <w:lastRenderedPageBreak/>
               <w:t>Atmospheric Dispersion Modelling</w:t>
             </w:r>
           </w:p>
@@ -7375,7 +7591,6 @@
                 <w:color w:val="000000"/>
                 <w:szCs w:val="19"/>
               </w:rPr>
-              <w:lastRenderedPageBreak/>
               <w:t>Causal Inference</w:t>
             </w:r>
           </w:p>
@@ -8107,21 +8322,52 @@
                 <w:color w:val="000000"/>
                 <w:szCs w:val="19"/>
               </w:rPr>
-              <w:t>-hour horizon — Model RMSE 80.8 vs Persistence baseline 112.9 (28.4% improvement); 48-hour horizon — Model RMSE 82.5 vs Persistence baseline 114.3 (27.8% improvement); 72-hour horizon — Model RMSE 83.8 vs Persistence baseline 114.2 (26.6% improvement). Err</w:t>
-            </w:r>
-            <w:r>
-              <w:rPr>
-                <w:color w:val="000000"/>
-                <w:szCs w:val="19"/>
-              </w:rPr>
-              <w:t>or rises with horizon, as it genuinely should for an honest multi-horizon forecaster, since each horizon now trains against its own real future target rather than reusing one shared prediction. Re-validation on real archived CAAQMS data rather than the syn</w:t>
-            </w:r>
-            <w:r>
-              <w:rPr>
-                <w:color w:val="000000"/>
-                <w:szCs w:val="19"/>
-              </w:rPr>
-              <w:t>thetic calibration set (Section 5.1) remains the next step before a production pilot. Full notebook: /notebooks/</w:t>
+              <w:t>-hour horizon — Model RMSE 80.9 vs Persistence baseline 112.9 (28.3% improvement); 48-hour horizon — Model RMSE 82.6 vs Persistence baseline 114.3 (27.8% improvement); 72-hour horizon — Model RMSE 83.8 vs Persistence baseline 114.2 (26.6% improvement). Err</w:t>
+            </w:r>
+            <w:r>
+              <w:rPr>
+                <w:color w:val="000000"/>
+                <w:szCs w:val="19"/>
+              </w:rPr>
+              <w:t xml:space="preserve">or rises with horizon, as it genuinely should for an honest multi-horizon forecaster, since each </w:t>
+            </w:r>
+            <w:r>
+              <w:rPr>
+                <w:color w:val="000000"/>
+                <w:szCs w:val="19"/>
+              </w:rPr>
+              <w:lastRenderedPageBreak/>
+              <w:t xml:space="preserve">horizon now trains against its own real future target rather than reusing one shared prediction. These same trained models are called live from the </w:t>
+            </w:r>
+            <w:proofErr w:type="spellStart"/>
+            <w:r>
+              <w:rPr>
+                <w:color w:val="000000"/>
+                <w:szCs w:val="19"/>
+              </w:rPr>
+              <w:t>Streamlit</w:t>
+            </w:r>
+            <w:proofErr w:type="spellEnd"/>
+            <w:r>
+              <w:rPr>
+                <w:color w:val="000000"/>
+                <w:szCs w:val="19"/>
+              </w:rPr>
+              <w:t xml:space="preserve"> a</w:t>
+            </w:r>
+            <w:r>
+              <w:rPr>
+                <w:color w:val="000000"/>
+                <w:szCs w:val="19"/>
+              </w:rPr>
+              <w:t>pp for the dashboard's 24h/48h/72h forecast checkpoints, so this benchmark reflects what the running demo actually shows, not only an offline script. Re-validation on real archived CAAQMS data rather than the synthetic calibration set (Section 5.1) remains</w:t>
+            </w:r>
+            <w:r>
+              <w:rPr>
+                <w:color w:val="000000"/>
+                <w:szCs w:val="19"/>
+              </w:rPr>
+              <w:t xml:space="preserve"> the next step before a production pilot. Full notebook: /notebooks/</w:t>
             </w:r>
             <w:proofErr w:type="spellStart"/>
             <w:r>
@@ -8177,6 +8423,7 @@
                 <w:color w:val="000000"/>
                 <w:szCs w:val="19"/>
               </w:rPr>
+              <w:lastRenderedPageBreak/>
               <w:t>Enforcement recommendation quality, rated by domain experts</w:t>
             </w:r>
           </w:p>
@@ -8209,14 +8456,14 @@
                 <w:color w:val="000000"/>
                 <w:szCs w:val="19"/>
               </w:rPr>
-              <w:t xml:space="preserve">Present Agent 3's ranked action </w:t>
-            </w:r>
-            <w:r>
-              <w:rPr>
-                <w:color w:val="000000"/>
-                <w:szCs w:val="19"/>
-              </w:rPr>
-              <w:t>lists for sample wards to retired/serving pollution-control officials for a 1–5 relevance and feasibility rating, with the supporting evidence trail included. (Planned; not yet conducted.)</w:t>
+              <w:t>Present Agent 3's ranked action lists for sample wards to retired/serving po</w:t>
+            </w:r>
+            <w:r>
+              <w:rPr>
+                <w:color w:val="000000"/>
+                <w:szCs w:val="19"/>
+              </w:rPr>
+              <w:t>llution-control officials for a 1–5 relevance and feasibility rating, with the supporting evidence trail included. (Planned; not yet conducted.)</w:t>
             </w:r>
           </w:p>
         </w:tc>
@@ -8330,7 +8577,6 @@
                 <w:color w:val="000000"/>
                 <w:szCs w:val="19"/>
               </w:rPr>
-              <w:lastRenderedPageBreak/>
               <w:t>Demonstrated reduction in response time from signal to intervention</w:t>
             </w:r>
           </w:p>
@@ -9159,6 +9405,7 @@
           <w:color w:val="1F3864"/>
           <w:szCs w:val="30"/>
         </w:rPr>
+        <w:lastRenderedPageBreak/>
         <w:t>15. Business Impact &amp; Scalability</w:t>
       </w:r>
     </w:p>
@@ -9300,22 +9547,7 @@
           <w:sz w:val="22"/>
           <w:szCs w:val="21"/>
         </w:rPr>
-        <w:t xml:space="preserve">, not re-engineering. The roadmap is: (1) Delhi NCR and Mumbai at </w:t>
-      </w:r>
-      <w:r>
-        <w:rPr>
-          <w:sz w:val="22"/>
-          <w:szCs w:val="21"/>
-        </w:rPr>
-        <w:lastRenderedPageBreak/>
-        <w:t>hackathon-prototype stage; (2) Kolkata, Bengaluru, and Chennai as t</w:t>
-      </w:r>
-      <w:r>
-        <w:rPr>
-          <w:sz w:val="22"/>
-          <w:szCs w:val="21"/>
-        </w:rPr>
-        <w:t xml:space="preserve">he next </w:t>
+        <w:t xml:space="preserve">, not re-engineering. All 5 target cities are already live for Agent 4's AQI comparison today, since every city draws from the same </w:t>
       </w:r>
       <w:proofErr w:type="spellStart"/>
       <w:r>
@@ -9323,7 +9555,14 @@
           <w:sz w:val="22"/>
           <w:szCs w:val="21"/>
         </w:rPr>
-        <w:t>onboarding</w:t>
+        <w:t>O</w:t>
+      </w:r>
+      <w:r>
+        <w:rPr>
+          <w:sz w:val="22"/>
+          <w:szCs w:val="21"/>
+        </w:rPr>
+        <w:t>penAQ</w:t>
       </w:r>
       <w:proofErr w:type="spellEnd"/>
       <w:r>
@@ -9331,7 +9570,69 @@
           <w:sz w:val="22"/>
           <w:szCs w:val="21"/>
         </w:rPr>
-        <w:t xml:space="preserve"> wave; (3) any city with CAAQMS coverage thereafter, since the 900+ station national network already exists — PRAANA's contribution is the intelligence layer on top of infrastructure India has already built.</w:t>
+        <w:t xml:space="preserve"> v3 + Open-</w:t>
+      </w:r>
+      <w:proofErr w:type="spellStart"/>
+      <w:r>
+        <w:rPr>
+          <w:sz w:val="22"/>
+          <w:szCs w:val="21"/>
+        </w:rPr>
+        <w:t>Meteo</w:t>
+      </w:r>
+      <w:proofErr w:type="spellEnd"/>
+      <w:r>
+        <w:rPr>
+          <w:sz w:val="22"/>
+          <w:szCs w:val="21"/>
+        </w:rPr>
+        <w:t xml:space="preserve"> pipeline (</w:t>
+      </w:r>
+      <w:proofErr w:type="spellStart"/>
+      <w:r>
+        <w:rPr>
+          <w:sz w:val="22"/>
+          <w:szCs w:val="21"/>
+        </w:rPr>
+        <w:t>src</w:t>
+      </w:r>
+      <w:proofErr w:type="spellEnd"/>
+      <w:r>
+        <w:rPr>
+          <w:sz w:val="22"/>
+          <w:szCs w:val="21"/>
+        </w:rPr>
+        <w:t xml:space="preserve">/data_sources.py, </w:t>
+      </w:r>
+      <w:proofErr w:type="spellStart"/>
+      <w:r>
+        <w:rPr>
+          <w:sz w:val="22"/>
+          <w:szCs w:val="21"/>
+        </w:rPr>
+        <w:t>src</w:t>
+      </w:r>
+      <w:proofErr w:type="spellEnd"/>
+      <w:r>
+        <w:rPr>
+          <w:sz w:val="22"/>
+          <w:szCs w:val="21"/>
+        </w:rPr>
+        <w:t>/multicity.py). What remains staged is validation depth, not basic coverage: Delhi NCR and Mumbai have the trained per-horizon forecast models and the wind-confounder self-test built against their dat</w:t>
+      </w:r>
+      <w:r>
+        <w:rPr>
+          <w:sz w:val="22"/>
+          <w:szCs w:val="21"/>
+        </w:rPr>
+        <w:t>a; extending that same depth of validation to Kolkata, Bengaluru, and Chennai — and beyond, to any city with CAAQMS coverage, since the 900+ station national network already exists — is the near-term roadmap. PRAANA's contribution is the intelligence layer</w:t>
+      </w:r>
+      <w:r>
+        <w:rPr>
+          <w:sz w:val="22"/>
+          <w:szCs w:val="21"/>
+        </w:rPr>
+        <w:t xml:space="preserve"> on top of infrastructure India has already built.</w:t>
       </w:r>
     </w:p>
     <w:p>
@@ -9412,14 +9713,14 @@
           <w:sz w:val="22"/>
           <w:szCs w:val="21"/>
         </w:rPr>
-        <w:t xml:space="preserve"> cost low and making the model attractive for government adoption without recurring data-licensin</w:t>
-      </w:r>
-      <w:r>
-        <w:rPr>
-          <w:sz w:val="22"/>
-          <w:szCs w:val="21"/>
-        </w:rPr>
-        <w:t>g overhead.</w:t>
+        <w:t xml:space="preserve"> cost low and ma</w:t>
+      </w:r>
+      <w:r>
+        <w:rPr>
+          <w:sz w:val="22"/>
+          <w:szCs w:val="21"/>
+        </w:rPr>
+        <w:t>king the model attractive for government adoption without recurring data-licensing overhead.</w:t>
       </w:r>
     </w:p>
     <w:p>
@@ -10076,7 +10377,17 @@
           <w:sz w:val="22"/>
           <w:szCs w:val="21"/>
         </w:rPr>
-        <w:t xml:space="preserve">d by ward, across every major Indian city willing to plug in its sensor feed. And it says so with the same discipline it asks of its own AI agents: every claim in this document is labelled as either running code or a named next step, never the two blurred </w:t>
+        <w:t xml:space="preserve">d by ward, across every major Indian </w:t>
+      </w:r>
+      <w:r>
+        <w:rPr>
+          <w:b/>
+          <w:bCs/>
+          <w:sz w:val="22"/>
+          <w:szCs w:val="21"/>
+        </w:rPr>
+        <w:lastRenderedPageBreak/>
+        <w:t xml:space="preserve">city willing to plug in its sensor feed. And it says so with the same discipline it asks of its own AI agents: every claim in this document is labelled as either running code or a named next step, never the two blurred </w:t>
       </w:r>
       <w:r>
         <w:rPr>
@@ -10101,64 +10412,64 @@
 <file path=word/numbering.xml><?xml version="1.0" encoding="utf-8"?>
 <w:numbering xmlns:wpc="http://schemas.microsoft.com/office/word/2010/wordprocessingCanvas" xmlns:cx="http://schemas.microsoft.com/office/drawing/2014/chartex" xmlns:mc="http://schemas.openxmlformats.org/markup-compatibility/2006" xmlns:o="urn:schemas-microsoft-com:office:office" xmlns:r="http://schemas.openxmlformats.org/officeDocument/2006/relationships" xmlns:m="http://schemas.openxmlformats.org/officeDocument/2006/math" xmlns:v="urn:schemas-microsoft-com:vml" xmlns:wp14="http://schemas.microsoft.com/office/word/2010/wordprocessingDrawing" xmlns:wp="http://schemas.openxmlformats.org/drawingml/2006/wordprocessingDrawing" xmlns:w10="urn:schemas-microsoft-com:office:word" xmlns:w="http://schemas.openxmlformats.org/wordprocessingml/2006/main" xmlns:w14="http://schemas.microsoft.com/office/word/2010/wordml" xmlns:w15="http://schemas.microsoft.com/office/word/2012/wordml" xmlns:w16se="http://schemas.microsoft.com/office/word/2015/wordml/symex" xmlns:wpg="http://schemas.microsoft.com/office/word/2010/wordprocessingGroup" xmlns:wpi="http://schemas.microsoft.com/office/word/2010/wordprocessingInk" xmlns:wne="http://schemas.microsoft.com/office/word/2006/wordml" xmlns:wps="http://schemas.microsoft.com/office/word/2010/wordprocessingShape" mc:Ignorable="w14 w15 w16se wp14">
   <w:abstractNum w:abstractNumId="0" w15:restartNumberingAfterBreak="0">
-    <w:nsid w:val="08055DB7"/>
+    <w:nsid w:val="144F4E61"/>
     <w:multiLevelType w:val="hybridMultilevel"/>
-    <w:tmpl w:val="ED5A18F6"/>
-    <w:lvl w:ilvl="0" w:tplc="F454F03A">
+    <w:tmpl w:val="3A3427CA"/>
+    <w:lvl w:ilvl="0" w:tplc="E5C076E2">
       <w:start w:val="1"/>
-      <w:numFmt w:val="decimal"/>
-      <w:lvlText w:val="%1."/>
+      <w:numFmt w:val="bullet"/>
+      <w:lvlText w:val="•"/>
       <w:lvlJc w:val="left"/>
       <w:pPr>
         <w:ind w:left="420" w:hanging="260"/>
       </w:pPr>
     </w:lvl>
-    <w:lvl w:ilvl="1" w:tplc="79E011AC">
+    <w:lvl w:ilvl="1" w:tplc="58CC052C">
       <w:numFmt w:val="decimal"/>
       <w:lvlText w:val=""/>
       <w:lvlJc w:val="left"/>
     </w:lvl>
-    <w:lvl w:ilvl="2" w:tplc="4DC84048">
+    <w:lvl w:ilvl="2" w:tplc="B568F65C">
       <w:numFmt w:val="decimal"/>
       <w:lvlText w:val=""/>
       <w:lvlJc w:val="left"/>
     </w:lvl>
-    <w:lvl w:ilvl="3" w:tplc="721C12E0">
+    <w:lvl w:ilvl="3" w:tplc="E940D3E8">
       <w:numFmt w:val="decimal"/>
       <w:lvlText w:val=""/>
       <w:lvlJc w:val="left"/>
     </w:lvl>
-    <w:lvl w:ilvl="4" w:tplc="74A665DA">
+    <w:lvl w:ilvl="4" w:tplc="F71ECA98">
       <w:numFmt w:val="decimal"/>
       <w:lvlText w:val=""/>
       <w:lvlJc w:val="left"/>
     </w:lvl>
-    <w:lvl w:ilvl="5" w:tplc="D1EE4DC8">
+    <w:lvl w:ilvl="5" w:tplc="AC34E5DE">
       <w:numFmt w:val="decimal"/>
       <w:lvlText w:val=""/>
       <w:lvlJc w:val="left"/>
     </w:lvl>
-    <w:lvl w:ilvl="6" w:tplc="6AA0DE38">
+    <w:lvl w:ilvl="6" w:tplc="30C0910A">
       <w:numFmt w:val="decimal"/>
       <w:lvlText w:val=""/>
       <w:lvlJc w:val="left"/>
     </w:lvl>
-    <w:lvl w:ilvl="7" w:tplc="89A63296">
+    <w:lvl w:ilvl="7" w:tplc="BD6EAE48">
       <w:numFmt w:val="decimal"/>
       <w:lvlText w:val=""/>
       <w:lvlJc w:val="left"/>
     </w:lvl>
-    <w:lvl w:ilvl="8" w:tplc="2384E25C">
+    <w:lvl w:ilvl="8" w:tplc="AC18CA28">
       <w:numFmt w:val="decimal"/>
       <w:lvlText w:val=""/>
       <w:lvlJc w:val="left"/>
     </w:lvl>
   </w:abstractNum>
   <w:abstractNum w:abstractNumId="1" w15:restartNumberingAfterBreak="0">
-    <w:nsid w:val="6F4E6117"/>
+    <w:nsid w:val="3B5F7E86"/>
     <w:multiLevelType w:val="hybridMultilevel"/>
-    <w:tmpl w:val="D0F26CF2"/>
-    <w:lvl w:ilvl="0" w:tplc="21867142">
+    <w:tmpl w:val="7B746EBA"/>
+    <w:lvl w:ilvl="0" w:tplc="6DDCFE8A">
       <w:start w:val="1"/>
       <w:numFmt w:val="bullet"/>
       <w:lvlText w:val="●"/>
@@ -10167,7 +10478,7 @@
         <w:ind w:left="720" w:hanging="360"/>
       </w:pPr>
     </w:lvl>
-    <w:lvl w:ilvl="1" w:tplc="746CD15A">
+    <w:lvl w:ilvl="1" w:tplc="84BEE87A">
       <w:start w:val="1"/>
       <w:numFmt w:val="bullet"/>
       <w:lvlText w:val="○"/>
@@ -10176,7 +10487,7 @@
         <w:ind w:left="1440" w:hanging="360"/>
       </w:pPr>
     </w:lvl>
-    <w:lvl w:ilvl="2" w:tplc="F72E4C82">
+    <w:lvl w:ilvl="2" w:tplc="2800F832">
       <w:start w:val="1"/>
       <w:numFmt w:val="bullet"/>
       <w:lvlText w:val="■"/>
@@ -10185,7 +10496,7 @@
         <w:ind w:left="2160" w:hanging="360"/>
       </w:pPr>
     </w:lvl>
-    <w:lvl w:ilvl="3" w:tplc="9510FC60">
+    <w:lvl w:ilvl="3" w:tplc="2C2AA036">
       <w:start w:val="1"/>
       <w:numFmt w:val="bullet"/>
       <w:lvlText w:val="●"/>
@@ -10194,7 +10505,7 @@
         <w:ind w:left="2880" w:hanging="360"/>
       </w:pPr>
     </w:lvl>
-    <w:lvl w:ilvl="4" w:tplc="791230F6">
+    <w:lvl w:ilvl="4" w:tplc="D630A018">
       <w:start w:val="1"/>
       <w:numFmt w:val="bullet"/>
       <w:lvlText w:val="○"/>
@@ -10203,7 +10514,7 @@
         <w:ind w:left="3600" w:hanging="360"/>
       </w:pPr>
     </w:lvl>
-    <w:lvl w:ilvl="5" w:tplc="C69AB3C0">
+    <w:lvl w:ilvl="5" w:tplc="5FB40994">
       <w:start w:val="1"/>
       <w:numFmt w:val="bullet"/>
       <w:lvlText w:val="■"/>
@@ -10212,7 +10523,7 @@
         <w:ind w:left="4320" w:hanging="360"/>
       </w:pPr>
     </w:lvl>
-    <w:lvl w:ilvl="6" w:tplc="6100C656">
+    <w:lvl w:ilvl="6" w:tplc="F5623AD8">
       <w:start w:val="1"/>
       <w:numFmt w:val="bullet"/>
       <w:lvlText w:val="●"/>
@@ -10221,7 +10532,7 @@
         <w:ind w:left="5040" w:hanging="360"/>
       </w:pPr>
     </w:lvl>
-    <w:lvl w:ilvl="7" w:tplc="726C2B64">
+    <w:lvl w:ilvl="7" w:tplc="BF420088">
       <w:start w:val="1"/>
       <w:numFmt w:val="bullet"/>
       <w:lvlText w:val="●"/>
@@ -10230,7 +10541,7 @@
         <w:ind w:left="5760" w:hanging="360"/>
       </w:pPr>
     </w:lvl>
-    <w:lvl w:ilvl="8" w:tplc="F20C375A">
+    <w:lvl w:ilvl="8" w:tplc="9850C146">
       <w:start w:val="1"/>
       <w:numFmt w:val="bullet"/>
       <w:lvlText w:val="●"/>
@@ -10241,54 +10552,54 @@
     </w:lvl>
   </w:abstractNum>
   <w:abstractNum w:abstractNumId="2" w15:restartNumberingAfterBreak="0">
-    <w:nsid w:val="7E1F47CD"/>
+    <w:nsid w:val="78CE4476"/>
     <w:multiLevelType w:val="hybridMultilevel"/>
-    <w:tmpl w:val="728E0BF2"/>
-    <w:lvl w:ilvl="0" w:tplc="C24A4CDE">
+    <w:tmpl w:val="6EAC448E"/>
+    <w:lvl w:ilvl="0" w:tplc="4D981A2A">
       <w:start w:val="1"/>
-      <w:numFmt w:val="bullet"/>
-      <w:lvlText w:val="•"/>
+      <w:numFmt w:val="decimal"/>
+      <w:lvlText w:val="%1."/>
       <w:lvlJc w:val="left"/>
       <w:pPr>
         <w:ind w:left="420" w:hanging="260"/>
       </w:pPr>
     </w:lvl>
-    <w:lvl w:ilvl="1" w:tplc="4F98EFC8">
+    <w:lvl w:ilvl="1" w:tplc="0A7801D6">
       <w:numFmt w:val="decimal"/>
       <w:lvlText w:val=""/>
       <w:lvlJc w:val="left"/>
     </w:lvl>
-    <w:lvl w:ilvl="2" w:tplc="8F2AB17C">
+    <w:lvl w:ilvl="2" w:tplc="D1646CB6">
       <w:numFmt w:val="decimal"/>
       <w:lvlText w:val=""/>
       <w:lvlJc w:val="left"/>
     </w:lvl>
-    <w:lvl w:ilvl="3" w:tplc="89226A6E">
+    <w:lvl w:ilvl="3" w:tplc="DE8060F6">
       <w:numFmt w:val="decimal"/>
       <w:lvlText w:val=""/>
       <w:lvlJc w:val="left"/>
     </w:lvl>
-    <w:lvl w:ilvl="4" w:tplc="8F1EF934">
+    <w:lvl w:ilvl="4" w:tplc="4D145082">
       <w:numFmt w:val="decimal"/>
       <w:lvlText w:val=""/>
       <w:lvlJc w:val="left"/>
     </w:lvl>
-    <w:lvl w:ilvl="5" w:tplc="0A7CBBF0">
+    <w:lvl w:ilvl="5" w:tplc="1BBC8622">
       <w:numFmt w:val="decimal"/>
       <w:lvlText w:val=""/>
       <w:lvlJc w:val="left"/>
     </w:lvl>
-    <w:lvl w:ilvl="6" w:tplc="7A1054C0">
+    <w:lvl w:ilvl="6" w:tplc="3522E158">
       <w:numFmt w:val="decimal"/>
       <w:lvlText w:val=""/>
       <w:lvlJc w:val="left"/>
     </w:lvl>
-    <w:lvl w:ilvl="7" w:tplc="E3C80C70">
+    <w:lvl w:ilvl="7" w:tplc="A3883EE8">
       <w:numFmt w:val="decimal"/>
       <w:lvlText w:val=""/>
       <w:lvlJc w:val="left"/>
     </w:lvl>
-    <w:lvl w:ilvl="8" w:tplc="A558B18E">
+    <w:lvl w:ilvl="8" w:tplc="96E8E880">
       <w:numFmt w:val="decimal"/>
       <w:lvlText w:val=""/>
       <w:lvlJc w:val="left"/>
@@ -10301,13 +10612,13 @@
     </w:lvlOverride>
   </w:num>
   <w:num w:numId="2">
-    <w:abstractNumId w:val="2"/>
+    <w:abstractNumId w:val="0"/>
     <w:lvlOverride w:ilvl="0">
       <w:startOverride w:val="1"/>
     </w:lvlOverride>
   </w:num>
   <w:num w:numId="3">
-    <w:abstractNumId w:val="0"/>
+    <w:abstractNumId w:val="2"/>
     <w:lvlOverride w:ilvl="0">
       <w:startOverride w:val="1"/>
     </w:lvlOverride>

</xml_diff>